<commit_message>
Portfolio cleanup and publication-ready structure
</commit_message>
<xml_diff>
--- a/CA1_Report_SoledadYash_GRC_Final.docx
+++ b/CA1_Report_SoledadYash_GRC_Final.docx
@@ -61,7 +61,7 @@
         <mc:AlternateContent>
           <mc:Choice Requires="wpg">
             <w:drawing>
-              <wp:anchor behindDoc="0" distT="0" distB="0" distL="0" distR="9525" simplePos="0" locked="0" layoutInCell="0" allowOverlap="1" relativeHeight="3" wp14:anchorId="071FA30A">
+              <wp:anchor behindDoc="0" distT="0" distB="0" distL="0" distR="0" simplePos="0" locked="0" layoutInCell="0" allowOverlap="1" relativeHeight="3" wp14:anchorId="071FA30A">
                 <wp:simplePos x="0" y="0"/>
                 <wp:positionH relativeFrom="page">
                   <wp:posOffset>438150</wp:posOffset>
@@ -124,8 +124,8 @@
                         <wps:cNvSpPr/>
                         <wps:spPr>
                           <a:xfrm>
-                            <a:off x="0" y="8916120"/>
-                            <a:ext cx="228600" cy="227880"/>
+                            <a:off x="0" y="8917200"/>
+                            <a:ext cx="228600" cy="226800"/>
                           </a:xfrm>
                           <a:prstGeom prst="rect">
                             <a:avLst/>
@@ -162,14 +162,14 @@
           <mc:Fallback>
             <w:pict>
               <v:group id="shape_0" alt="Group 24" style="position:absolute;margin-left:34.5pt;margin-top:-95.15pt;width:18pt;height:720pt" coordorigin="690,-1903" coordsize="360,14400">
-                <v:rect id="shape_0" ID="Rectangle 3" path="m0,0l-2147483645,0l-2147483645,-2147483646l0,-2147483646xe" fillcolor="#e97132" stroked="f" o:allowincell="f" style="position:absolute;left:690;top:-1903;width:359;height:13829;mso-wrap-style:none;v-text-anchor:middle;mso-position-horizontal-relative:page;mso-position-vertical-relative:margin">
-                  <v:fill o:detectmouseclick="t" type="solid" color2="#168ecd"/>
-                  <v:stroke color="#3465a4" weight="12600" joinstyle="miter" endcap="flat"/>
+                <v:rect id="shape_0" ID="Rectangle 3" path="m0,0l-2147483645,0l-2147483645,-2147483646l0,-2147483646xe" fillcolor="#c0504d" stroked="f" o:allowincell="f" style="position:absolute;left:690;top:-1903;width:359;height:13829;mso-wrap-style:none;v-text-anchor:middle;mso-position-horizontal-relative:page;mso-position-vertical-relative:margin">
+                  <v:fill o:detectmouseclick="t" type="solid" color2="#3fafb2"/>
+                  <v:stroke color="#3465a4" weight="25560" joinstyle="round" endcap="flat"/>
                   <w10:wrap type="none"/>
                 </v:rect>
-                <v:rect id="shape_0" ID="Rectangle 4" path="m0,0l-2147483645,0l-2147483645,-2147483646l0,-2147483646xe" fillcolor="#156082" stroked="f" o:allowincell="f" style="position:absolute;left:690;top:12138;width:359;height:358;mso-wrap-style:none;v-text-anchor:middle;mso-position-horizontal-relative:page;mso-position-vertical-relative:margin">
-                  <v:fill o:detectmouseclick="t" type="solid" color2="#ea9f7d"/>
-                  <v:stroke color="#3465a4" weight="12600" joinstyle="miter" endcap="flat"/>
+                <v:rect id="shape_0" ID="Rectangle 4" path="m0,0l-2147483645,0l-2147483645,-2147483646l0,-2147483646xe" fillcolor="#4f81bd" stroked="f" o:allowincell="f" style="position:absolute;left:690;top:12140;width:359;height:356;mso-wrap-style:none;v-text-anchor:middle;mso-position-horizontal-relative:page;mso-position-vertical-relative:margin">
+                  <v:fill o:detectmouseclick="t" type="solid" color2="#b07e42"/>
+                  <v:stroke color="#3465a4" weight="25560" joinstyle="round" endcap="flat"/>
                   <w10:wrap type="none"/>
                 </v:rect>
               </v:group>
@@ -270,12 +270,7 @@
         <w:tc>
           <w:tcPr>
             <w:tcW w:w="3255" w:type="dxa"/>
-            <w:tcBorders>
-              <w:top w:val="nil"/>
-              <w:left w:val="nil"/>
-              <w:bottom w:val="nil"/>
-              <w:right w:val="nil"/>
-            </w:tcBorders>
+            <w:tcBorders/>
           </w:tcPr>
           <w:p>
             <w:pPr>
@@ -310,12 +305,7 @@
         <w:tc>
           <w:tcPr>
             <w:tcW w:w="5760" w:type="dxa"/>
-            <w:tcBorders>
-              <w:top w:val="nil"/>
-              <w:left w:val="nil"/>
-              <w:bottom w:val="nil"/>
-              <w:right w:val="nil"/>
-            </w:tcBorders>
+            <w:tcBorders/>
           </w:tcPr>
           <w:p>
             <w:pPr>
@@ -348,12 +338,7 @@
         <w:tc>
           <w:tcPr>
             <w:tcW w:w="3255" w:type="dxa"/>
-            <w:tcBorders>
-              <w:top w:val="nil"/>
-              <w:left w:val="nil"/>
-              <w:bottom w:val="nil"/>
-              <w:right w:val="nil"/>
-            </w:tcBorders>
+            <w:tcBorders/>
           </w:tcPr>
           <w:p>
             <w:pPr>
@@ -388,12 +373,7 @@
         <w:tc>
           <w:tcPr>
             <w:tcW w:w="5760" w:type="dxa"/>
-            <w:tcBorders>
-              <w:top w:val="nil"/>
-              <w:left w:val="nil"/>
-              <w:bottom w:val="nil"/>
-              <w:right w:val="nil"/>
-            </w:tcBorders>
+            <w:tcBorders/>
           </w:tcPr>
           <w:p>
             <w:pPr>
@@ -416,18 +396,7 @@
                 <w:szCs w:val="32"/>
                 <w:lang w:val="en-IE" w:eastAsia="en-US" w:bidi="ar-SA"/>
               </w:rPr>
-              <w:t>202514</w:t>
-            </w:r>
-            <w:r>
-              <w:rPr>
-                <w:rFonts w:eastAsia="Aptos" w:cs=""/>
-                <w:color w:themeColor="text1" w:val="000000"/>
-                <w:kern w:val="2"/>
-                <w:sz w:val="32"/>
-                <w:szCs w:val="32"/>
-                <w:lang w:val="en-IE" w:eastAsia="en-US" w:bidi="ar-SA"/>
-              </w:rPr>
-              <w:t>1</w:t>
+              <w:t>2025141</w:t>
             </w:r>
           </w:p>
         </w:tc>
@@ -437,12 +406,7 @@
         <w:tc>
           <w:tcPr>
             <w:tcW w:w="3255" w:type="dxa"/>
-            <w:tcBorders>
-              <w:top w:val="nil"/>
-              <w:left w:val="nil"/>
-              <w:bottom w:val="nil"/>
-              <w:right w:val="nil"/>
-            </w:tcBorders>
+            <w:tcBorders/>
           </w:tcPr>
           <w:p>
             <w:pPr>
@@ -477,12 +441,7 @@
         <w:tc>
           <w:tcPr>
             <w:tcW w:w="5760" w:type="dxa"/>
-            <w:tcBorders>
-              <w:top w:val="nil"/>
-              <w:left w:val="nil"/>
-              <w:bottom w:val="nil"/>
-              <w:right w:val="nil"/>
-            </w:tcBorders>
+            <w:tcBorders/>
           </w:tcPr>
           <w:p>
             <w:pPr>
@@ -515,12 +474,7 @@
         <w:tc>
           <w:tcPr>
             <w:tcW w:w="3255" w:type="dxa"/>
-            <w:tcBorders>
-              <w:top w:val="nil"/>
-              <w:left w:val="nil"/>
-              <w:bottom w:val="nil"/>
-              <w:right w:val="nil"/>
-            </w:tcBorders>
+            <w:tcBorders/>
           </w:tcPr>
           <w:p>
             <w:pPr>
@@ -555,12 +509,7 @@
         <w:tc>
           <w:tcPr>
             <w:tcW w:w="5760" w:type="dxa"/>
-            <w:tcBorders>
-              <w:top w:val="nil"/>
-              <w:left w:val="nil"/>
-              <w:bottom w:val="nil"/>
-              <w:right w:val="nil"/>
-            </w:tcBorders>
+            <w:tcBorders/>
           </w:tcPr>
           <w:p>
             <w:pPr>
@@ -593,12 +542,7 @@
         <w:tc>
           <w:tcPr>
             <w:tcW w:w="3255" w:type="dxa"/>
-            <w:tcBorders>
-              <w:top w:val="nil"/>
-              <w:left w:val="nil"/>
-              <w:bottom w:val="nil"/>
-              <w:right w:val="nil"/>
-            </w:tcBorders>
+            <w:tcBorders/>
           </w:tcPr>
           <w:p>
             <w:pPr>
@@ -633,12 +577,7 @@
         <w:tc>
           <w:tcPr>
             <w:tcW w:w="5760" w:type="dxa"/>
-            <w:tcBorders>
-              <w:top w:val="nil"/>
-              <w:left w:val="nil"/>
-              <w:bottom w:val="nil"/>
-              <w:right w:val="nil"/>
-            </w:tcBorders>
+            <w:tcBorders/>
           </w:tcPr>
           <w:p>
             <w:pPr>
@@ -671,12 +610,7 @@
         <w:tc>
           <w:tcPr>
             <w:tcW w:w="3255" w:type="dxa"/>
-            <w:tcBorders>
-              <w:top w:val="nil"/>
-              <w:left w:val="nil"/>
-              <w:bottom w:val="nil"/>
-              <w:right w:val="nil"/>
-            </w:tcBorders>
+            <w:tcBorders/>
           </w:tcPr>
           <w:p>
             <w:pPr>
@@ -711,12 +645,7 @@
         <w:tc>
           <w:tcPr>
             <w:tcW w:w="5760" w:type="dxa"/>
-            <w:tcBorders>
-              <w:top w:val="nil"/>
-              <w:left w:val="nil"/>
-              <w:bottom w:val="nil"/>
-              <w:right w:val="nil"/>
-            </w:tcBorders>
+            <w:tcBorders/>
           </w:tcPr>
           <w:p>
             <w:pPr>
@@ -739,18 +668,7 @@
                 <w:szCs w:val="32"/>
                 <w:lang w:val="en-IE" w:eastAsia="en-US" w:bidi="ar-SA"/>
               </w:rPr>
-              <w:t>02</w:t>
-            </w:r>
-            <w:r>
-              <w:rPr>
-                <w:rFonts w:eastAsia="Aptos" w:cs=""/>
-                <w:color w:themeColor="text1" w:val="000000"/>
-                <w:kern w:val="2"/>
-                <w:sz w:val="32"/>
-                <w:szCs w:val="32"/>
-                <w:lang w:val="en-IE" w:eastAsia="en-US" w:bidi="ar-SA"/>
-              </w:rPr>
-              <w:t xml:space="preserve"> November 2025</w:t>
+              <w:t>02 November 2025</w:t>
             </w:r>
           </w:p>
         </w:tc>
@@ -782,7 +700,7 @@
         <mc:AlternateContent>
           <mc:Choice Requires="wps">
             <w:drawing>
-              <wp:anchor behindDoc="0" distT="19050" distB="28575" distL="19050" distR="19050" simplePos="0" locked="0" layoutInCell="0" allowOverlap="1" relativeHeight="4" wp14:anchorId="47C01022">
+              <wp:anchor behindDoc="0" distT="15240" distB="13970" distL="14605" distR="14605" simplePos="0" locked="0" layoutInCell="0" allowOverlap="1" relativeHeight="4" wp14:anchorId="47C01022">
                 <wp:simplePos x="0" y="0"/>
                 <wp:positionH relativeFrom="margin">
                   <wp:align>left</wp:align>
@@ -860,6 +778,7 @@
                             <w:r>
                               <w:rPr>
                                 <w:rFonts w:cs="Calibri"/>
+                                <w:color w:val="000000"/>
                                 <w:sz w:val="28"/>
                                 <w:szCs w:val="28"/>
                               </w:rPr>
@@ -878,6 +797,7 @@
                             <w:r>
                               <w:rPr>
                                 <w:rFonts w:cs="Calibri"/>
+                                <w:color w:val="000000"/>
                                 <w:sz w:val="28"/>
                                 <w:szCs w:val="28"/>
                               </w:rPr>
@@ -896,6 +816,7 @@
                             <w:r>
                               <w:rPr>
                                 <w:rFonts w:cs="Calibri"/>
+                                <w:color w:val="000000"/>
                                 <w:sz w:val="28"/>
                                 <w:szCs w:val="28"/>
                               </w:rPr>
@@ -904,6 +825,7 @@
                             <w:r>
                               <w:rPr>
                                 <w:rFonts w:cs="Calibri"/>
+                                <w:color w:val="000000"/>
                                 <w:sz w:val="28"/>
                                 <w:szCs w:val="28"/>
                               </w:rPr>
@@ -924,7 +846,7 @@
           </mc:Choice>
           <mc:Fallback>
             <w:pict>
-              <v:rect id="shape_0" ID="Text Box 1" path="m0,0l-2147483645,0l-2147483645,-2147483646l0,-2147483646xe" fillcolor="white" stroked="t" o:allowincell="f" style="position:absolute;margin-left:1.5pt;margin-top:66.75pt;width:454.45pt;height:224.2pt;mso-wrap-style:square;v-text-anchor:top;mso-position-horizontal:left;mso-position-horizontal-relative:margin" wp14:anchorId="47C01022">
+              <v:rect id="shape_0" ID="Text Box 1" path="m0,0l-2147483645,0l-2147483645,-2147483646l0,-2147483646xe" fillcolor="white" stroked="t" o:allowincell="f" style="position:absolute;margin-left:1.15pt;margin-top:66.75pt;width:454.45pt;height:224.2pt;mso-wrap-style:square;v-text-anchor:top;mso-position-horizontal:left;mso-position-horizontal-relative:margin" wp14:anchorId="47C01022">
                 <v:fill o:detectmouseclick="t" type="solid" color2="black"/>
                 <v:stroke color="#156082" weight="28440" joinstyle="round" endcap="flat"/>
                 <v:textbox>
@@ -965,6 +887,7 @@
                       <w:r>
                         <w:rPr>
                           <w:rFonts w:cs="Calibri"/>
+                          <w:color w:val="000000"/>
                           <w:sz w:val="28"/>
                           <w:szCs w:val="28"/>
                         </w:rPr>
@@ -983,6 +906,7 @@
                       <w:r>
                         <w:rPr>
                           <w:rFonts w:cs="Calibri"/>
+                          <w:color w:val="000000"/>
                           <w:sz w:val="28"/>
                           <w:szCs w:val="28"/>
                         </w:rPr>
@@ -1001,6 +925,7 @@
                       <w:r>
                         <w:rPr>
                           <w:rFonts w:cs="Calibri"/>
+                          <w:color w:val="000000"/>
                           <w:sz w:val="28"/>
                           <w:szCs w:val="28"/>
                         </w:rPr>
@@ -1009,6 +934,7 @@
                       <w:r>
                         <w:rPr>
                           <w:rFonts w:cs="Calibri"/>
+                          <w:color w:val="000000"/>
                           <w:sz w:val="28"/>
                           <w:szCs w:val="28"/>
                         </w:rPr>
@@ -1443,6 +1369,22 @@
               <w:t>9</w:t>
             </w:r>
           </w:hyperlink>
+        </w:p>
+        <w:p>
+          <w:pPr>
+            <w:pStyle w:val="TOC1"/>
+            <w:rPr/>
+          </w:pPr>
+          <w:hyperlink w:anchor="__RefHeading___Toc296_1237688292">
+            <w:r>
+              <w:rPr>
+                <w:rStyle w:val="Enlacedelndice"/>
+              </w:rPr>
+              <w:t>Video report: https://www.veed.io/view/ef965d20-650e-4e56-b65f-4423b17bfb53?source=editor&amp;panel=share</w:t>
+              <w:tab/>
+              <w:t>9</w:t>
+            </w:r>
+          </w:hyperlink>
           <w:r>
             <w:rPr>
               <w:rStyle w:val="Enlacedelndice"/>
@@ -1460,7 +1402,9 @@
         </w:rPr>
       </w:pPr>
       <w:r>
-        <w:rPr/>
+        <w:rPr>
+          <w:rFonts w:cs="Calibri"/>
+        </w:rPr>
       </w:r>
     </w:p>
     <w:p>
@@ -1478,6 +1422,7 @@
     <w:p>
       <w:pPr>
         <w:pStyle w:val="Heading2"/>
+        <w:spacing w:before="0" w:after="0"/>
         <w:rPr/>
       </w:pPr>
       <w:bookmarkStart w:id="0" w:name="__RefHeading___Toc422_1557357574"/>
@@ -1929,11 +1874,7 @@
       </w:r>
       <w:r>
         <w:rPr/>
-        <w:t xml:space="preserve"> between governance quality and the Human Development Index. The colors range from red to blue. Red tones represent countries with high governance indicators but relatively weak human outcomes, while blue tones correspond to countries where governance and development progress move together in balance. </w:t>
-      </w:r>
-      <w:r>
-        <w:rPr/>
-        <w:t>The red zones often correspond to states with strong bureaucratic systems, low corruption, and solid rule of law scores but where living conditions, education, or income remain modest. These are systems that manage risk effectively yet fail to translate compliance into social improvement. They embody the GRC paradox: governance and formal control exist, but risk is managed inwardly rather than outwardly, and compliance measures internal order rather than collective well-being.</w:t>
+        <w:t xml:space="preserve"> between governance quality and the Human Development Index. The colors range from red to blue. Red tones represent countries with high governance indicators but relatively weak human outcomes, while blue tones correspond to countries where governance and development progress move together in balance. The red zones often correspond to states with strong bureaucratic systems, low corruption, and solid rule of law scores but where living conditions, education, or income remain modest. These are systems that manage risk effectively yet fail to translate compliance into social improvement. They embody the GRC paradox: governance and formal control exist, but risk is managed inwardly rather than outwardly, and compliance measures internal order rather than collective well-being.</w:t>
       </w:r>
     </w:p>
     <w:p>
@@ -2328,19 +2269,7 @@
       <w:bookmarkEnd w:id="12"/>
       <w:r>
         <w:rPr/>
-        <w:t xml:space="preserve">8. Appendix </w:t>
-      </w:r>
-      <w:r>
-        <w:rPr/>
-        <w:t>(</w:t>
-      </w:r>
-      <w:r>
-        <w:rPr/>
-        <w:t>AI Reflection</w:t>
-      </w:r>
-      <w:r>
-        <w:rPr/>
-        <w:t>)</w:t>
+        <w:t>8. Appendix (AI Reflection)</w:t>
       </w:r>
     </w:p>
     <w:p>
@@ -2468,6 +2397,80 @@
       </w:pPr>
       <w:r>
         <w:rPr/>
+      </w:r>
+    </w:p>
+    <w:p>
+      <w:pPr>
+        <w:pStyle w:val="Heading1"/>
+        <w:rPr/>
+      </w:pPr>
+      <w:bookmarkStart w:id="14" w:name="__RefHeading___Toc296_1237688292"/>
+      <w:bookmarkEnd w:id="14"/>
+      <w:r>
+        <w:rPr/>
+        <w:t>Video report:</w:t>
+      </w:r>
+    </w:p>
+    <w:p>
+      <w:pPr>
+        <w:pStyle w:val="Heading1"/>
+        <w:rPr/>
+      </w:pPr>
+      <w:r>
+        <w:rPr>
+          <w:rFonts w:ascii="Arial" w:hAnsi="Arial"/>
+          <w:b w:val="false"/>
+          <w:bCs w:val="false"/>
+          <w:sz w:val="22"/>
+          <w:szCs w:val="22"/>
+        </w:rPr>
+        <w:t xml:space="preserve"> </w:t>
+      </w:r>
+      <w:hyperlink r:id="rId9">
+        <w:r>
+          <w:rPr>
+            <w:rStyle w:val="Hyperlink"/>
+            <w:rFonts w:ascii="Arial" w:hAnsi="Arial"/>
+            <w:b w:val="false"/>
+            <w:bCs w:val="false"/>
+            <w:sz w:val="22"/>
+            <w:szCs w:val="22"/>
+          </w:rPr>
+          <w:t>https://www.veed.io/view/ef965d20-650e-4e56-b65f-4423b17bfb53?source=editor&amp;panel=share</w:t>
+        </w:r>
+      </w:hyperlink>
+    </w:p>
+    <w:p>
+      <w:pPr>
+        <w:pStyle w:val="Normal"/>
+        <w:rPr>
+          <w:rStyle w:val="Hyperlink"/>
+          <w:rFonts w:ascii="Arial" w:hAnsi="Arial"/>
+          <w:b w:val="false"/>
+          <w:bCs w:val="false"/>
+          <w:sz w:val="22"/>
+          <w:szCs w:val="22"/>
+        </w:rPr>
+      </w:pPr>
+      <w:r>
+        <w:rPr/>
+      </w:r>
+    </w:p>
+    <w:p>
+      <w:pPr>
+        <w:pStyle w:val="Normal"/>
+        <w:rPr/>
+      </w:pPr>
+      <w:r>
+        <w:rPr>
+          <w:rStyle w:val="Hyperlink"/>
+          <w:rFonts w:ascii="Arial" w:hAnsi="Arial"/>
+          <w:b w:val="false"/>
+          <w:bCs w:val="false"/>
+          <w:sz w:val="22"/>
+          <w:szCs w:val="22"/>
+        </w:rPr>
+        <w:t>https://drive.google.com/drive/folders/1cawgjfeVoUT7pca20hJhHIgEwnvYLNad?usp=drive_link</w:t>
       </w:r>
     </w:p>
     <w:p>
@@ -4766,6 +4769,18 @@
         <w:tab w:val="right" w:pos="8073" w:leader="dot"/>
       </w:tabs>
       <w:ind w:hanging="0" w:left="567"/>
+    </w:pPr>
+    <w:rPr/>
+  </w:style>
+  <w:style w:type="paragraph" w:styleId="TOC1">
+    <w:name w:val="TOC 1"/>
+    <w:basedOn w:val="Ndice"/>
+    <w:pPr>
+      <w:tabs>
+        <w:tab w:val="clear" w:pos="720"/>
+        <w:tab w:val="right" w:pos="8640" w:leader="dot"/>
+      </w:tabs>
+      <w:ind w:hanging="0" w:left="0"/>
     </w:pPr>
     <w:rPr/>
   </w:style>

</xml_diff>